<commit_message>
Include the updated  Template File
</commit_message>
<xml_diff>
--- a/PHOCS-Docgentemplates/PHOCS Pool Operating Permit Document Template_v1.0.docx
+++ b/PHOCS-Docgentemplates/PHOCS Pool Operating Permit Document Template_v1.0.docx
@@ -19,8 +19,8 @@
         <w:tblLook w:val="04A0" w:firstRow="1" w:lastRow="0" w:firstColumn="1" w:lastColumn="0" w:noHBand="0" w:noVBand="1"/>
       </w:tblPr>
       <w:tblGrid>
-        <w:gridCol w:w="3786"/>
-        <w:gridCol w:w="5707"/>
+        <w:gridCol w:w="4516"/>
+        <w:gridCol w:w="7535"/>
       </w:tblGrid>
       <w:tr>
         <w:tc>
@@ -226,6 +226,51 @@
                 <w:bCs/>
                 <w:sz w:val="24"/>
                 <w:szCs w:val="24"/>
+                <w:lang w:val="en-CA"/>
+              </w:rPr>
+            </w:pPr>
+            <w:r>
+              <w:rPr>
+                <w:rFonts w:ascii="BC Sans" w:hAnsi="BC Sans"/>
+                <w:b/>
+                <w:bCs/>
+                <w:sz w:val="24"/>
+                <w:szCs w:val="24"/>
+                <w:lang w:val="en-CA"/>
+              </w:rPr>
+              <w:t>{{</w:t>
+            </w:r>
+            <w:r>
+              <w:rPr>
+                <w:rFonts w:ascii="BC Sans" w:hAnsi="BC Sans"/>
+                <w:b/>
+                <w:bCs/>
+                <w:sz w:val="24"/>
+                <w:szCs w:val="24"/>
+                <w:lang w:val="en-CA"/>
+              </w:rPr>
+              <w:t>#</w:t>
+            </w:r>
+            <w:r>
+              <w:rPr>
+                <w:rFonts w:ascii="BC Sans" w:hAnsi="BC Sans"/>
+                <w:b/>
+                <w:bCs/>
+                <w:sz w:val="24"/>
+                <w:szCs w:val="24"/>
+                <w:lang w:val="en-CA"/>
+              </w:rPr>
+              <w:t xml:space="preserve">AccountCategoryL1}} </w:t>
+            </w:r>
+          </w:p>
+          <w:p>
+            <w:pPr>
+              <w:rPr>
+                <w:rFonts w:ascii="BC Sans" w:hAnsi="BC Sans"/>
+                <w:b/>
+                <w:bCs/>
+                <w:sz w:val="24"/>
+                <w:szCs w:val="24"/>
               </w:rPr>
             </w:pPr>
             <w:r>
@@ -250,7 +295,6 @@
                 <w:rFonts w:ascii="BC Sans" w:hAnsi="BC Sans"/>
                 <w:sz w:val="24"/>
                 <w:szCs w:val="24"/>
-                <w:lang w:val="en-CA"/>
               </w:rPr>
             </w:pPr>
             <w:r>
@@ -258,9 +302,26 @@
                 <w:rFonts w:ascii="BC Sans" w:hAnsi="BC Sans"/>
                 <w:sz w:val="24"/>
                 <w:szCs w:val="24"/>
-                <w:lang w:val="en-CA"/>
               </w:rPr>
-              <w:t xml:space="preserve">{{AccountCategoryL1}} </w:t>
+              <w:t>{{AccountCategoryL1</w:t>
+            </w:r>
+            <w:proofErr w:type="gramStart"/>
+            <w:r>
+              <w:rPr>
+                <w:rFonts w:ascii="BC Sans" w:hAnsi="BC Sans"/>
+                <w:sz w:val="24"/>
+                <w:szCs w:val="24"/>
+              </w:rPr>
+              <w:t>}}{</w:t>
+            </w:r>
+            <w:proofErr w:type="gramEnd"/>
+            <w:r>
+              <w:rPr>
+                <w:rFonts w:ascii="BC Sans" w:hAnsi="BC Sans"/>
+                <w:sz w:val="24"/>
+                <w:szCs w:val="24"/>
+              </w:rPr>
+              <w:t>{#AccountCategoryL2}}</w:t>
             </w:r>
           </w:p>
           <w:p>
@@ -269,7 +330,6 @@
                 <w:rFonts w:ascii="BC Sans" w:hAnsi="BC Sans"/>
                 <w:sz w:val="24"/>
                 <w:szCs w:val="24"/>
-                <w:lang w:val="en-CA"/>
               </w:rPr>
             </w:pPr>
             <w:r>
@@ -277,9 +337,44 @@
                 <w:rFonts w:ascii="BC Sans" w:hAnsi="BC Sans"/>
                 <w:sz w:val="24"/>
                 <w:szCs w:val="24"/>
-                <w:lang w:val="en-CA"/>
               </w:rPr>
-              <w:t>{{AccountCategoryL2}}</w:t>
+              <w:t>{{AccountCategoryL2</w:t>
+            </w:r>
+            <w:proofErr w:type="gramStart"/>
+            <w:r>
+              <w:rPr>
+                <w:rFonts w:ascii="BC Sans" w:hAnsi="BC Sans"/>
+                <w:sz w:val="24"/>
+                <w:szCs w:val="24"/>
+              </w:rPr>
+              <w:t>}}{</w:t>
+            </w:r>
+            <w:proofErr w:type="gramEnd"/>
+            <w:r>
+              <w:rPr>
+                <w:rFonts w:ascii="BC Sans" w:hAnsi="BC Sans"/>
+                <w:sz w:val="24"/>
+                <w:szCs w:val="24"/>
+              </w:rPr>
+              <w:t>{/AccountCategoryL2</w:t>
+            </w:r>
+            <w:proofErr w:type="gramStart"/>
+            <w:r>
+              <w:rPr>
+                <w:rFonts w:ascii="BC Sans" w:hAnsi="BC Sans"/>
+                <w:sz w:val="24"/>
+                <w:szCs w:val="24"/>
+              </w:rPr>
+              <w:t>}}{</w:t>
+            </w:r>
+            <w:proofErr w:type="gramEnd"/>
+            <w:r>
+              <w:rPr>
+                <w:rFonts w:ascii="BC Sans" w:hAnsi="BC Sans"/>
+                <w:sz w:val="24"/>
+                <w:szCs w:val="24"/>
+              </w:rPr>
+              <w:t>{#AccountCategoryL3}}</w:t>
             </w:r>
           </w:p>
           <w:p>
@@ -288,7 +383,6 @@
                 <w:rFonts w:ascii="BC Sans" w:hAnsi="BC Sans"/>
                 <w:sz w:val="24"/>
                 <w:szCs w:val="24"/>
-                <w:lang w:val="en-CA"/>
               </w:rPr>
             </w:pPr>
             <w:r>
@@ -296,9 +390,44 @@
                 <w:rFonts w:ascii="BC Sans" w:hAnsi="BC Sans"/>
                 <w:sz w:val="24"/>
                 <w:szCs w:val="24"/>
-                <w:lang w:val="en-CA"/>
               </w:rPr>
-              <w:t xml:space="preserve">{{AccountCategoryL3}} </w:t>
+              <w:t>{{AccountCategoryL3</w:t>
+            </w:r>
+            <w:proofErr w:type="gramStart"/>
+            <w:r>
+              <w:rPr>
+                <w:rFonts w:ascii="BC Sans" w:hAnsi="BC Sans"/>
+                <w:sz w:val="24"/>
+                <w:szCs w:val="24"/>
+              </w:rPr>
+              <w:t>}}{</w:t>
+            </w:r>
+            <w:proofErr w:type="gramEnd"/>
+            <w:r>
+              <w:rPr>
+                <w:rFonts w:ascii="BC Sans" w:hAnsi="BC Sans"/>
+                <w:sz w:val="24"/>
+                <w:szCs w:val="24"/>
+              </w:rPr>
+              <w:t>{/AccountCategoryL3</w:t>
+            </w:r>
+            <w:proofErr w:type="gramStart"/>
+            <w:r>
+              <w:rPr>
+                <w:rFonts w:ascii="BC Sans" w:hAnsi="BC Sans"/>
+                <w:sz w:val="24"/>
+                <w:szCs w:val="24"/>
+              </w:rPr>
+              <w:t>}}{</w:t>
+            </w:r>
+            <w:proofErr w:type="gramEnd"/>
+            <w:r>
+              <w:rPr>
+                <w:rFonts w:ascii="BC Sans" w:hAnsi="BC Sans"/>
+                <w:sz w:val="24"/>
+                <w:szCs w:val="24"/>
+              </w:rPr>
+              <w:t>{/AccountCategoryL1}}</w:t>
             </w:r>
           </w:p>
           <w:p>
@@ -335,7 +464,59 @@
                 <w:sz w:val="24"/>
                 <w:szCs w:val="24"/>
               </w:rPr>
-              <w:t>Operation Schedule:</w:t>
+              <w:t>{{</w:t>
+            </w:r>
+            <w:r>
+              <w:rPr>
+                <w:rFonts w:ascii="BC Sans" w:hAnsi="BC Sans"/>
+                <w:b/>
+                <w:bCs/>
+                <w:sz w:val="24"/>
+                <w:szCs w:val="24"/>
+              </w:rPr>
+              <w:t>#</w:t>
+            </w:r>
+            <w:r>
+              <w:rPr>
+                <w:rFonts w:ascii="BC Sans" w:hAnsi="BC Sans"/>
+                <w:b/>
+                <w:bCs/>
+                <w:sz w:val="24"/>
+                <w:szCs w:val="24"/>
+              </w:rPr>
+              <w:t>PoolOperationSchedule</w:t>
+            </w:r>
+            <w:proofErr w:type="gramStart"/>
+            <w:r>
+              <w:rPr>
+                <w:rFonts w:ascii="BC Sans" w:hAnsi="BC Sans"/>
+                <w:b/>
+                <w:bCs/>
+                <w:sz w:val="24"/>
+                <w:szCs w:val="24"/>
+              </w:rPr>
+              <w:t>}}</w:t>
+            </w:r>
+            <w:r>
+              <w:rPr>
+                <w:rFonts w:ascii="BC Sans" w:hAnsi="BC Sans"/>
+                <w:b/>
+                <w:bCs/>
+                <w:sz w:val="24"/>
+                <w:szCs w:val="24"/>
+              </w:rPr>
+              <w:t>Operation</w:t>
+            </w:r>
+            <w:proofErr w:type="gramEnd"/>
+            <w:r>
+              <w:rPr>
+                <w:rFonts w:ascii="BC Sans" w:hAnsi="BC Sans"/>
+                <w:b/>
+                <w:bCs/>
+                <w:sz w:val="24"/>
+                <w:szCs w:val="24"/>
+              </w:rPr>
+              <w:t xml:space="preserve"> Schedule:</w:t>
             </w:r>
           </w:p>
         </w:tc>
@@ -358,6 +539,50 @@
                 <w:szCs w:val="24"/>
               </w:rPr>
               <w:t>{{</w:t>
+            </w:r>
+            <w:proofErr w:type="spellStart"/>
+            <w:r>
+              <w:rPr>
+                <w:rFonts w:ascii="BC Sans" w:hAnsi="BC Sans"/>
+                <w:sz w:val="24"/>
+                <w:szCs w:val="24"/>
+              </w:rPr>
+              <w:t>PoolOperationSchedule</w:t>
+            </w:r>
+            <w:proofErr w:type="spellEnd"/>
+            <w:proofErr w:type="gramStart"/>
+            <w:r>
+              <w:rPr>
+                <w:rFonts w:ascii="BC Sans" w:hAnsi="BC Sans"/>
+                <w:sz w:val="24"/>
+                <w:szCs w:val="24"/>
+              </w:rPr>
+              <w:t>}}</w:t>
+            </w:r>
+            <w:r>
+              <w:rPr>
+                <w:rFonts w:ascii="BC Sans" w:hAnsi="BC Sans"/>
+                <w:sz w:val="24"/>
+                <w:szCs w:val="24"/>
+              </w:rPr>
+              <w:t>{</w:t>
+            </w:r>
+            <w:proofErr w:type="gramEnd"/>
+            <w:r>
+              <w:rPr>
+                <w:rFonts w:ascii="BC Sans" w:hAnsi="BC Sans"/>
+                <w:sz w:val="24"/>
+                <w:szCs w:val="24"/>
+              </w:rPr>
+              <w:t>{</w:t>
+            </w:r>
+            <w:r>
+              <w:rPr>
+                <w:rFonts w:ascii="BC Sans" w:hAnsi="BC Sans"/>
+                <w:sz w:val="24"/>
+                <w:szCs w:val="24"/>
+              </w:rPr>
+              <w:t>/</w:t>
             </w:r>
             <w:proofErr w:type="spellStart"/>
             <w:r>
@@ -401,6 +626,63 @@
                 <w:bCs/>
                 <w:sz w:val="24"/>
                 <w:szCs w:val="24"/>
+                <w:lang w:val="en-CA"/>
+              </w:rPr>
+            </w:pPr>
+            <w:r>
+              <w:rPr>
+                <w:rFonts w:ascii="BC Sans" w:hAnsi="BC Sans"/>
+                <w:b/>
+                <w:bCs/>
+                <w:sz w:val="24"/>
+                <w:szCs w:val="24"/>
+                <w:lang w:val="en-CA"/>
+              </w:rPr>
+              <w:t>{{</w:t>
+            </w:r>
+            <w:r>
+              <w:rPr>
+                <w:rFonts w:ascii="BC Sans" w:hAnsi="BC Sans"/>
+                <w:b/>
+                <w:bCs/>
+                <w:sz w:val="24"/>
+                <w:szCs w:val="24"/>
+                <w:lang w:val="en-CA"/>
+              </w:rPr>
+              <w:t>#</w:t>
+            </w:r>
+            <w:proofErr w:type="spellStart"/>
+            <w:r>
+              <w:rPr>
+                <w:rFonts w:ascii="BC Sans" w:hAnsi="BC Sans"/>
+                <w:b/>
+                <w:bCs/>
+                <w:sz w:val="24"/>
+                <w:szCs w:val="24"/>
+              </w:rPr>
+              <w:t>BLOrganizationName</w:t>
+            </w:r>
+            <w:proofErr w:type="spellEnd"/>
+            <w:r>
+              <w:rPr>
+                <w:rFonts w:ascii="BC Sans" w:hAnsi="BC Sans"/>
+                <w:b/>
+                <w:bCs/>
+                <w:sz w:val="24"/>
+                <w:szCs w:val="24"/>
+                <w:lang w:val="en-CA"/>
+              </w:rPr>
+              <w:t>}}</w:t>
+            </w:r>
+          </w:p>
+          <w:p>
+            <w:pPr>
+              <w:rPr>
+                <w:rFonts w:ascii="BC Sans" w:hAnsi="BC Sans"/>
+                <w:b/>
+                <w:bCs/>
+                <w:sz w:val="24"/>
+                <w:szCs w:val="24"/>
               </w:rPr>
             </w:pPr>
             <w:r>
@@ -411,6 +693,7 @@
                 <w:sz w:val="24"/>
                 <w:szCs w:val="24"/>
               </w:rPr>
+              <w:lastRenderedPageBreak/>
               <w:t>Owner:</w:t>
             </w:r>
           </w:p>
@@ -435,7 +718,56 @@
                 <w:szCs w:val="24"/>
                 <w:lang w:val="en-CA"/>
               </w:rPr>
+              <w:lastRenderedPageBreak/>
               <w:t>{{</w:t>
+            </w:r>
+            <w:proofErr w:type="spellStart"/>
+            <w:r>
+              <w:rPr>
+                <w:rFonts w:ascii="BC Sans" w:hAnsi="BC Sans"/>
+                <w:sz w:val="24"/>
+                <w:szCs w:val="24"/>
+              </w:rPr>
+              <w:t>BLOrganizationName</w:t>
+            </w:r>
+            <w:proofErr w:type="spellEnd"/>
+            <w:proofErr w:type="gramStart"/>
+            <w:r>
+              <w:rPr>
+                <w:rFonts w:ascii="BC Sans" w:hAnsi="BC Sans"/>
+                <w:sz w:val="24"/>
+                <w:szCs w:val="24"/>
+                <w:lang w:val="en-CA"/>
+              </w:rPr>
+              <w:t>}}</w:t>
+            </w:r>
+            <w:r>
+              <w:rPr>
+                <w:rFonts w:ascii="BC Sans" w:hAnsi="BC Sans"/>
+                <w:sz w:val="24"/>
+                <w:szCs w:val="24"/>
+                <w:lang w:val="en-CA"/>
+              </w:rPr>
+              <w:t>{</w:t>
+            </w:r>
+            <w:proofErr w:type="gramEnd"/>
+            <w:r>
+              <w:rPr>
+                <w:rFonts w:ascii="BC Sans" w:hAnsi="BC Sans"/>
+                <w:sz w:val="24"/>
+                <w:szCs w:val="24"/>
+                <w:lang w:val="en-CA"/>
+              </w:rPr>
+              <w:t>{</w:t>
+            </w:r>
+            <w:r>
+              <w:rPr>
+                <w:rFonts w:ascii="BC Sans" w:hAnsi="BC Sans"/>
+                <w:sz w:val="24"/>
+                <w:szCs w:val="24"/>
+                <w:lang w:val="en-CA"/>
+              </w:rPr>
+              <w:t>/</w:t>
             </w:r>
             <w:proofErr w:type="spellStart"/>
             <w:r>
@@ -456,6 +788,16 @@
               </w:rPr>
               <w:t>}}</w:t>
             </w:r>
+          </w:p>
+          <w:p>
+            <w:pPr>
+              <w:rPr>
+                <w:rFonts w:ascii="BC Sans" w:hAnsi="BC Sans"/>
+                <w:sz w:val="24"/>
+                <w:szCs w:val="24"/>
+                <w:lang w:val="en-CA"/>
+              </w:rPr>
+            </w:pPr>
           </w:p>
           <w:p>
             <w:pPr>
@@ -934,10 +1276,7 @@
       <w:jc w:val="center"/>
     </w:pPr>
     <w:r>
-      <w:t>THIS PERMIT IS NON-TRANSFERABLE AND MUST BE DISPLAYED IN A CONSPICUOUS LOCATION</w:t>
-    </w:r>
-    <w:r>
-      <w:t xml:space="preserve"> </w:t>
+      <w:t xml:space="preserve">THIS PERMIT IS NON-TRANSFERABLE AND MUST BE DISPLAYED IN A CONSPICUOUS LOCATION </w:t>
     </w:r>
   </w:p>
   <w:p>
@@ -1789,25 +2128,7 @@
               <w:sz w:val="26"/>
               <w:szCs w:val="26"/>
             </w:rPr>
-            <w:t>{{</w:t>
-          </w:r>
-          <w:r>
-            <w:rPr>
-              <w:rFonts w:ascii="BC Sans" w:hAnsi="BC Sans"/>
-              <w:color w:val="000000"/>
-              <w:sz w:val="26"/>
-              <w:szCs w:val="26"/>
-            </w:rPr>
-            <w:t>#</w:t>
-          </w:r>
-          <w:r>
-            <w:rPr>
-              <w:rFonts w:ascii="BC Sans" w:hAnsi="BC Sans"/>
-              <w:color w:val="000000"/>
-              <w:sz w:val="26"/>
-              <w:szCs w:val="26"/>
-            </w:rPr>
-            <w:t>BLEffectiveDate</w:t>
+            <w:t>{{#BLEffectiveDate</w:t>
           </w:r>
           <w:proofErr w:type="gramStart"/>
           <w:r>
@@ -1898,16 +2219,7 @@
               <w:sz w:val="26"/>
               <w:szCs w:val="26"/>
             </w:rPr>
-            <w:t>{</w:t>
-          </w:r>
-          <w:r>
-            <w:rPr>
-              <w:rFonts w:ascii="BC Sans" w:hAnsi="BC Sans"/>
-              <w:color w:val="000000"/>
-              <w:sz w:val="26"/>
-              <w:szCs w:val="26"/>
-            </w:rPr>
-            <w:t>/</w:t>
+            <w:t>{/</w:t>
           </w:r>
           <w:proofErr w:type="spellStart"/>
           <w:r>
@@ -1984,16 +2296,7 @@
               <w:sz w:val="26"/>
               <w:szCs w:val="26"/>
             </w:rPr>
-            <w:t>#</w:t>
-          </w:r>
-          <w:r>
-            <w:rPr>
-              <w:rFonts w:ascii="BC Sans" w:hAnsi="BC Sans"/>
-              <w:color w:val="000000"/>
-              <w:sz w:val="26"/>
-              <w:szCs w:val="26"/>
-            </w:rPr>
-            <w:t>BLExpiryDate</w:t>
+            <w:t>#BLExpiryDate</w:t>
           </w:r>
           <w:proofErr w:type="gramStart"/>
           <w:r>
@@ -3856,6 +4159,7 @@
   <w:style w:type="character" w:default="1" w:styleId="DefaultParagraphFont">
     <w:name w:val="Default Paragraph Font"/>
     <w:uiPriority w:val="1"/>
+    <w:semiHidden/>
     <w:unhideWhenUsed/>
   </w:style>
   <w:style w:type="table" w:default="1" w:styleId="TableNormal">
@@ -15005,17 +15309,19 @@
 </file>
 
 <file path=customXml/item1.xml><?xml version="1.0" encoding="utf-8"?>
-<p:properties xmlns:p="http://schemas.microsoft.com/office/2006/metadata/properties" xmlns:xsi="http://www.w3.org/2001/XMLSchema-instance" xmlns:pc="http://schemas.microsoft.com/office/infopath/2007/PartnerControls">
-  <documentManagement>
-    <lcf76f155ced4ddcb4097134ff3c332f xmlns="94d5cf59-5162-48bc-aa9b-620df72947f5">
-      <Terms xmlns="http://schemas.microsoft.com/office/infopath/2007/PartnerControls"/>
-    </lcf76f155ced4ddcb4097134ff3c332f>
-    <TaxCatchAll xmlns="8350b7c0-334b-4e19-bfc1-744f6a979eee" xsi:nil="true"/>
-  </documentManagement>
-</p:properties>
+<b:Sources xmlns:b="http://schemas.openxmlformats.org/officeDocument/2006/bibliography" xmlns="http://schemas.openxmlformats.org/officeDocument/2006/bibliography" SelectedStyle="/APA.XSL" StyleName="APA"/>
 </file>
 
 <file path=customXml/item2.xml><?xml version="1.0" encoding="utf-8"?>
+<?mso-contentType ?>
+<FormTemplates xmlns="http://schemas.microsoft.com/sharepoint/v3/contenttype/forms">
+  <Display>DocumentLibraryForm</Display>
+  <Edit>DocumentLibraryForm</Edit>
+  <New>DocumentLibraryForm</New>
+</FormTemplates>
+</file>
+
+<file path=customXml/item3.xml><?xml version="1.0" encoding="utf-8"?>
 <ct:contentTypeSchema xmlns:ct="http://schemas.microsoft.com/office/2006/metadata/contentType" xmlns:ma="http://schemas.microsoft.com/office/2006/metadata/properties/metaAttributes" ct:_="" ma:_="" ma:contentTypeName="Document" ma:contentTypeID="0x01010015F16144C0593A4A82C8AE0B67DB460F" ma:contentTypeVersion="11" ma:contentTypeDescription="Create a new document." ma:contentTypeScope="" ma:versionID="f03428ffc1746d68619392bc270e65d0">
   <xsd:schema xmlns:xsd="http://www.w3.org/2001/XMLSchema" xmlns:xs="http://www.w3.org/2001/XMLSchema" xmlns:p="http://schemas.microsoft.com/office/2006/metadata/properties" xmlns:ns2="94d5cf59-5162-48bc-aa9b-620df72947f5" xmlns:ns3="8350b7c0-334b-4e19-bfc1-744f6a979eee" targetNamespace="http://schemas.microsoft.com/office/2006/metadata/properties" ma:root="true" ma:fieldsID="2206ae29c74f0be434f81d51f34f460d" ns2:_="" ns3:_="">
     <xsd:import namespace="94d5cf59-5162-48bc-aa9b-620df72947f5"/>
@@ -15210,31 +15516,34 @@
 </ct:contentTypeSchema>
 </file>
 
-<file path=customXml/item3.xml><?xml version="1.0" encoding="utf-8"?>
-<?mso-contentType ?>
-<FormTemplates xmlns="http://schemas.microsoft.com/sharepoint/v3/contenttype/forms">
-  <Display>DocumentLibraryForm</Display>
-  <Edit>DocumentLibraryForm</Edit>
-  <New>DocumentLibraryForm</New>
-</FormTemplates>
-</file>
-
 <file path=customXml/item4.xml><?xml version="1.0" encoding="utf-8"?>
-<b:Sources xmlns:b="http://schemas.openxmlformats.org/officeDocument/2006/bibliography" xmlns="http://schemas.openxmlformats.org/officeDocument/2006/bibliography" SelectedStyle="/APA.XSL" StyleName="APA"/>
+<p:properties xmlns:p="http://schemas.microsoft.com/office/2006/metadata/properties" xmlns:xsi="http://www.w3.org/2001/XMLSchema-instance" xmlns:pc="http://schemas.microsoft.com/office/infopath/2007/PartnerControls">
+  <documentManagement>
+    <lcf76f155ced4ddcb4097134ff3c332f xmlns="94d5cf59-5162-48bc-aa9b-620df72947f5">
+      <Terms xmlns="http://schemas.microsoft.com/office/infopath/2007/PartnerControls"/>
+    </lcf76f155ced4ddcb4097134ff3c332f>
+    <TaxCatchAll xmlns="8350b7c0-334b-4e19-bfc1-744f6a979eee" xsi:nil="true"/>
+  </documentManagement>
+</p:properties>
 </file>
 
 <file path=customXml/itemProps1.xml><?xml version="1.0" encoding="utf-8"?>
-<ds:datastoreItem xmlns:ds="http://schemas.openxmlformats.org/officeDocument/2006/customXml" ds:itemID="{61ED79F1-5630-4B1C-A47C-F6A42359E588}">
+<ds:datastoreItem xmlns:ds="http://schemas.openxmlformats.org/officeDocument/2006/customXml" ds:itemID="{EF278816-EC6F-A645-907D-7F25AECB1D4A}">
   <ds:schemaRefs>
-    <ds:schemaRef ds:uri="http://schemas.microsoft.com/office/2006/metadata/properties"/>
-    <ds:schemaRef ds:uri="http://schemas.microsoft.com/office/infopath/2007/PartnerControls"/>
-    <ds:schemaRef ds:uri="94d5cf59-5162-48bc-aa9b-620df72947f5"/>
-    <ds:schemaRef ds:uri="8350b7c0-334b-4e19-bfc1-744f6a979eee"/>
+    <ds:schemaRef ds:uri="http://schemas.openxmlformats.org/officeDocument/2006/bibliography"/>
   </ds:schemaRefs>
 </ds:datastoreItem>
 </file>
 
 <file path=customXml/itemProps2.xml><?xml version="1.0" encoding="utf-8"?>
+<ds:datastoreItem xmlns:ds="http://schemas.openxmlformats.org/officeDocument/2006/customXml" ds:itemID="{91A8AB22-D8CB-4C35-BBCC-40F5043EBB53}">
+  <ds:schemaRefs>
+    <ds:schemaRef ds:uri="http://schemas.microsoft.com/sharepoint/v3/contenttype/forms"/>
+  </ds:schemaRefs>
+</ds:datastoreItem>
+</file>
+
+<file path=customXml/itemProps3.xml><?xml version="1.0" encoding="utf-8"?>
 <ds:datastoreItem xmlns:ds="http://schemas.openxmlformats.org/officeDocument/2006/customXml" ds:itemID="{716A724E-36BE-4088-9F4F-670D68551C4A}">
   <ds:schemaRefs>
     <ds:schemaRef ds:uri="http://schemas.microsoft.com/office/2006/metadata/contentType"/>
@@ -15253,18 +15562,13 @@
 </ds:datastoreItem>
 </file>
 
-<file path=customXml/itemProps3.xml><?xml version="1.0" encoding="utf-8"?>
-<ds:datastoreItem xmlns:ds="http://schemas.openxmlformats.org/officeDocument/2006/customXml" ds:itemID="{91A8AB22-D8CB-4C35-BBCC-40F5043EBB53}">
+<file path=customXml/itemProps4.xml><?xml version="1.0" encoding="utf-8"?>
+<ds:datastoreItem xmlns:ds="http://schemas.openxmlformats.org/officeDocument/2006/customXml" ds:itemID="{61ED79F1-5630-4B1C-A47C-F6A42359E588}">
   <ds:schemaRefs>
-    <ds:schemaRef ds:uri="http://schemas.microsoft.com/sharepoint/v3/contenttype/forms"/>
-  </ds:schemaRefs>
-</ds:datastoreItem>
-</file>
-
-<file path=customXml/itemProps4.xml><?xml version="1.0" encoding="utf-8"?>
-<ds:datastoreItem xmlns:ds="http://schemas.openxmlformats.org/officeDocument/2006/customXml" ds:itemID="{EF278816-EC6F-A645-907D-7F25AECB1D4A}">
-  <ds:schemaRefs>
-    <ds:schemaRef ds:uri="http://schemas.openxmlformats.org/officeDocument/2006/bibliography"/>
+    <ds:schemaRef ds:uri="http://schemas.microsoft.com/office/2006/metadata/properties"/>
+    <ds:schemaRef ds:uri="http://schemas.microsoft.com/office/infopath/2007/PartnerControls"/>
+    <ds:schemaRef ds:uri="94d5cf59-5162-48bc-aa9b-620df72947f5"/>
+    <ds:schemaRef ds:uri="8350b7c0-334b-4e19-bfc1-744f6a979eee"/>
   </ds:schemaRefs>
 </ds:datastoreItem>
 </file>

</xml_diff>